<commit_message>
doc: add the new modules to the task book
</commit_message>
<xml_diff>
--- a/任务书 (2).docx
+++ b/任务书 (2).docx
@@ -6,6 +6,9 @@
       <w:pPr>
         <w:spacing w:after="156"/>
         <w:jc w:val="center"/>
+        <w:rPr>
+          <w:rFonts w:hint="eastAsia"/>
+        </w:rPr>
       </w:pPr>
       <w:r>
         <w:rPr>
@@ -58,6 +61,7 @@
             <w:pPr>
               <w:jc w:val="center"/>
               <w:rPr>
+                <w:rFonts w:hint="eastAsia"/>
                 <w:sz w:val="28"/>
                 <w:szCs w:val="28"/>
               </w:rPr>
@@ -85,6 +89,7 @@
             <w:pPr>
               <w:jc w:val="center"/>
               <w:rPr>
+                <w:rFonts w:hint="eastAsia"/>
                 <w:sz w:val="28"/>
                 <w:szCs w:val="28"/>
               </w:rPr>
@@ -112,6 +117,7 @@
             <w:pPr>
               <w:jc w:val="center"/>
               <w:rPr>
+                <w:rFonts w:hint="eastAsia"/>
                 <w:sz w:val="28"/>
                 <w:szCs w:val="28"/>
               </w:rPr>
@@ -140,6 +146,7 @@
               <w:snapToGrid w:val="0"/>
               <w:jc w:val="center"/>
               <w:rPr>
+                <w:rFonts w:hint="eastAsia"/>
                 <w:sz w:val="28"/>
                 <w:szCs w:val="28"/>
               </w:rPr>
@@ -159,6 +166,9 @@
           <w:p>
             <w:pPr>
               <w:jc w:val="center"/>
+              <w:rPr>
+                <w:rFonts w:hint="eastAsia"/>
+              </w:rPr>
             </w:pPr>
             <w:r>
               <w:rPr>
@@ -184,6 +194,7 @@
               <w:snapToGrid w:val="0"/>
               <w:jc w:val="center"/>
               <w:rPr>
+                <w:rFonts w:hint="eastAsia"/>
                 <w:sz w:val="28"/>
                 <w:szCs w:val="28"/>
               </w:rPr>
@@ -209,6 +220,9 @@
           <w:p>
             <w:pPr>
               <w:jc w:val="center"/>
+              <w:rPr>
+                <w:rFonts w:hint="eastAsia"/>
+              </w:rPr>
             </w:pPr>
             <w:r>
               <w:rPr>
@@ -234,6 +248,7 @@
             <w:pPr>
               <w:jc w:val="center"/>
               <w:rPr>
+                <w:rFonts w:hint="eastAsia"/>
                 <w:sz w:val="28"/>
                 <w:szCs w:val="28"/>
               </w:rPr>
@@ -260,6 +275,9 @@
           <w:p>
             <w:pPr>
               <w:jc w:val="center"/>
+              <w:rPr>
+                <w:rFonts w:hint="eastAsia"/>
+              </w:rPr>
             </w:pPr>
             <w:r>
               <w:rPr>
@@ -285,6 +303,7 @@
             <w:pPr>
               <w:jc w:val="center"/>
               <w:rPr>
+                <w:rFonts w:hint="eastAsia"/>
                 <w:sz w:val="28"/>
                 <w:szCs w:val="28"/>
               </w:rPr>
@@ -317,6 +336,9 @@
           <w:p>
             <w:pPr>
               <w:jc w:val="center"/>
+              <w:rPr>
+                <w:rFonts w:hint="eastAsia"/>
+              </w:rPr>
             </w:pPr>
             <w:r>
               <w:rPr>
@@ -341,6 +363,7 @@
             <w:pPr>
               <w:jc w:val="center"/>
               <w:rPr>
+                <w:rFonts w:hint="eastAsia"/>
                 <w:sz w:val="28"/>
                 <w:szCs w:val="28"/>
               </w:rPr>
@@ -369,6 +392,7 @@
             <w:pPr>
               <w:jc w:val="center"/>
               <w:rPr>
+                <w:rFonts w:hint="eastAsia"/>
                 <w:sz w:val="28"/>
                 <w:szCs w:val="28"/>
               </w:rPr>
@@ -398,6 +422,7 @@
               <w:snapToGrid w:val="0"/>
               <w:jc w:val="center"/>
               <w:rPr>
+                <w:rFonts w:hint="eastAsia"/>
                 <w:sz w:val="28"/>
                 <w:szCs w:val="28"/>
               </w:rPr>
@@ -425,6 +450,7 @@
             <w:pPr>
               <w:jc w:val="center"/>
               <w:rPr>
+                <w:rFonts w:hint="eastAsia"/>
                 <w:sz w:val="28"/>
                 <w:szCs w:val="28"/>
               </w:rPr>
@@ -461,6 +487,7 @@
               <w:snapToGrid w:val="0"/>
               <w:jc w:val="center"/>
               <w:rPr>
+                <w:rFonts w:hint="eastAsia"/>
                 <w:sz w:val="28"/>
                 <w:szCs w:val="28"/>
               </w:rPr>
@@ -487,6 +514,9 @@
           <w:p>
             <w:pPr>
               <w:spacing w:after="60" w:line="252" w:lineRule="auto"/>
+              <w:rPr>
+                <w:rFonts w:hint="eastAsia"/>
+              </w:rPr>
             </w:pPr>
             <w:r>
               <w:rPr>
@@ -501,6 +531,7 @@
               <w:ind w:firstLine="420"/>
               <w:jc w:val="center"/>
               <w:rPr>
+                <w:rFonts w:hint="eastAsia"/>
                 <w:b/>
                 <w:sz w:val="24"/>
               </w:rPr>
@@ -553,6 +584,9 @@
               <w:spacing w:after="60" w:line="252" w:lineRule="auto"/>
               <w:ind w:firstLine="420"/>
               <w:jc w:val="center"/>
+              <w:rPr>
+                <w:rFonts w:hint="eastAsia"/>
+              </w:rPr>
             </w:pPr>
           </w:p>
         </w:tc>
@@ -576,6 +610,9 @@
           <w:p>
             <w:pPr>
               <w:spacing w:after="60" w:line="252" w:lineRule="auto"/>
+              <w:rPr>
+                <w:rFonts w:hint="eastAsia"/>
+              </w:rPr>
             </w:pPr>
             <w:r>
               <w:rPr>
@@ -587,6 +624,9 @@
           <w:p>
             <w:pPr>
               <w:spacing w:after="60" w:line="252" w:lineRule="auto"/>
+              <w:rPr>
+                <w:rFonts w:hint="eastAsia"/>
+              </w:rPr>
             </w:pPr>
             <w:r>
               <w:rPr>
@@ -599,6 +639,9 @@
             <w:pPr>
               <w:spacing w:after="60" w:line="252" w:lineRule="auto"/>
               <w:ind w:firstLine="420"/>
+              <w:rPr>
+                <w:rFonts w:hint="eastAsia"/>
+              </w:rPr>
             </w:pPr>
             <w:r>
               <w:t>随着高校第二课堂建设与综合素质评价体系的持续深化，校园内学术讲座、社团建设、志愿服务、学科竞赛、文体展演等各类学生活动呈现品类多、频次高、覆盖广的特征。当前校园活动信息普遍分散于社群渠道、官方公众号与线下通知等多元场景，形成碎片化信息分发格局，导致学生获取活动时间、场地、参与要求及综测认定规则的信息成本较高，易出现信息遗漏、规则咨询重复、参与记录追溯困难等问题。</w:t>
@@ -608,6 +651,9 @@
             <w:pPr>
               <w:spacing w:after="60" w:line="252" w:lineRule="auto"/>
               <w:ind w:firstLine="420"/>
+              <w:rPr>
+                <w:rFonts w:hint="eastAsia"/>
+              </w:rPr>
             </w:pPr>
             <w:r>
               <w:t>对各类学生组织与活动承办方而言，传统管理模式多依赖在线表单与人工台账统计，仅能覆盖基础报名环节，难以实现活动主体归属、参与资格核验与综合素质积分的一体化管理。活动结项后的学分认定环节高度依赖人工登记，易出现学分漏录、错录、重复认定等合规性风险，管理效率与数据准确性难以保障。</w:t>
@@ -617,6 +663,9 @@
             <w:pPr>
               <w:spacing w:after="60" w:line="252" w:lineRule="auto"/>
               <w:ind w:firstLine="420"/>
+              <w:rPr>
+                <w:rFonts w:hint="eastAsia"/>
+              </w:rPr>
             </w:pPr>
             <w:r>
               <w:t>基于上述校园治理痛点，本课设以数字化转型为抓手，研发智慧校园综测服务与智能治理平台。平台以校园活动全生命周期管理为主线，将报名参与作为核心业务节点，同步构建组织主体治理、综测学分管控、AI 智能交互四大核心能力模块，形成既相对独立又深度联动的业务体系，避免单一围绕报名流程做过度细化设计。</w:t>
@@ -625,6 +674,9 @@
           <w:p>
             <w:pPr>
               <w:spacing w:after="60" w:line="252" w:lineRule="auto"/>
+              <w:rPr>
+                <w:rFonts w:hint="eastAsia"/>
+              </w:rPr>
             </w:pPr>
             <w:r>
               <w:rPr>
@@ -637,6 +689,9 @@
             <w:pPr>
               <w:spacing w:after="60" w:line="252" w:lineRule="auto"/>
               <w:ind w:firstLine="420"/>
+              <w:rPr>
+                <w:rFonts w:hint="eastAsia"/>
+              </w:rPr>
             </w:pPr>
             <w:r>
               <w:t>对于学生群体，平台打造一站式综合素质发展服务入口。学生可统一查询活动名录、活动详情、主办主体、报名状态与个人综测积分台账，同时可依托智能助手快速获取近期活动推送、活动学分认定规则、个人积分结余等信息，大幅降低信息获取成本。</w:t>
@@ -646,6 +701,9 @@
             <w:pPr>
               <w:spacing w:after="60" w:line="252" w:lineRule="auto"/>
               <w:ind w:firstLine="420"/>
+              <w:rPr>
+                <w:rFonts w:hint="eastAsia"/>
+              </w:rPr>
             </w:pPr>
             <w:r>
               <w:t>对于学生组织负责人，平台提供数字化活动运维与学分管理工具。各类社团、院系及学生组织可自主维护主体信息，发布所属活动项目，实时查看报名参与情况，并在活动结项后依据实际参与记录提交综测加分申请，实现活动从发布到学分认定的全流程线上化。</w:t>
@@ -655,6 +713,9 @@
             <w:pPr>
               <w:spacing w:after="60" w:line="252" w:lineRule="auto"/>
               <w:ind w:firstLine="420"/>
+              <w:rPr>
+                <w:rFonts w:hint="eastAsia"/>
+              </w:rPr>
             </w:pPr>
             <w:r>
               <w:t>对于校级管理方，平台构建统一的综测数据治理与监管中台。管理员可统筹管控全域活动、组织主体与学分记录，开展加分申请合规性审核，大幅缩减线下统计与人工核验工作量，推动校园活动管理与综测积分认定的标准化、规范化、透明化。</w:t>
@@ -664,6 +725,9 @@
             <w:pPr>
               <w:spacing w:after="60" w:line="252" w:lineRule="auto"/>
               <w:ind w:firstLine="420"/>
+              <w:rPr>
+                <w:rFonts w:hint="eastAsia"/>
+              </w:rPr>
             </w:pPr>
             <w:r>
               <w:t>从课程实践维度看，平台覆盖前端交互、后端服务、数据建模、权限管控、业务规则约束与大模型接口集成等全链路技术点，可综合运用软件工程、数据库系统原理与 Web 全栈开发等专业知识，整体工作量</w:t>
@@ -681,6 +745,9 @@
           <w:p>
             <w:pPr>
               <w:spacing w:after="60" w:line="252" w:lineRule="auto"/>
+              <w:rPr>
+                <w:rFonts w:hint="eastAsia"/>
+              </w:rPr>
             </w:pPr>
             <w:r>
               <w:rPr>
@@ -693,6 +760,9 @@
             <w:pPr>
               <w:spacing w:after="60" w:line="252" w:lineRule="auto"/>
               <w:ind w:firstLine="420"/>
+              <w:rPr>
+                <w:rFonts w:hint="eastAsia"/>
+              </w:rPr>
             </w:pPr>
             <w:r>
               <w:t>第一，活动周期管</w:t>
@@ -715,6 +785,9 @@
             <w:pPr>
               <w:spacing w:after="60" w:line="252" w:lineRule="auto"/>
               <w:ind w:firstLine="420"/>
+              <w:rPr>
+                <w:rFonts w:hint="eastAsia"/>
+              </w:rPr>
             </w:pPr>
             <w:r>
               <w:t>第二，学生组织治理归属问题。平台需建立社团、院系、校级学生组织的主体信息档案，实现活动与主办组织的强关联映射，既保障学生可清晰追溯活动来源，也支撑管理方按组织维度开展活动数量、学分发放等数据统计。</w:t>
@@ -724,6 +797,9 @@
             <w:pPr>
               <w:spacing w:after="60" w:line="252" w:lineRule="auto"/>
               <w:ind w:firstLine="420"/>
+              <w:rPr>
+                <w:rFonts w:hint="eastAsia"/>
+              </w:rPr>
             </w:pPr>
             <w:r>
               <w:t>第三，综测</w:t>
@@ -751,6 +827,9 @@
             <w:pPr>
               <w:spacing w:after="60" w:line="252" w:lineRule="auto"/>
               <w:ind w:firstLine="420"/>
+              <w:rPr>
+                <w:rFonts w:hint="eastAsia"/>
+              </w:rPr>
             </w:pPr>
             <w:r>
               <w:t>第四，领域数据驱动的智能问答问题。平台需在后端侧完成大模型 API 的安全接入，基于活动、组织、报名、积分等业务数据构建领域化提示词，精准回应用户关于活动与综测的咨询；需保障 API 密钥的后端安全存储，同时留存全部问答记录以便合规审计。</w:t>
@@ -760,6 +839,9 @@
             <w:pPr>
               <w:spacing w:after="60" w:line="252" w:lineRule="auto"/>
               <w:ind w:firstLine="420"/>
+              <w:rPr>
+                <w:rFonts w:hint="eastAsia"/>
+              </w:rPr>
             </w:pPr>
             <w:r>
               <w:t>第五，多角色</w:t>
@@ -777,6 +859,9 @@
           <w:p>
             <w:pPr>
               <w:spacing w:after="60" w:line="252" w:lineRule="auto"/>
+              <w:rPr>
+                <w:rFonts w:hint="eastAsia"/>
+              </w:rPr>
             </w:pPr>
             <w:r>
               <w:rPr>
@@ -789,6 +874,9 @@
             <w:pPr>
               <w:spacing w:after="60" w:line="252" w:lineRule="auto"/>
               <w:ind w:firstLine="420"/>
+              <w:rPr>
+                <w:rFonts w:hint="eastAsia"/>
+              </w:rPr>
             </w:pPr>
             <w:r>
               <w:rPr>
@@ -801,6 +889,9 @@
             <w:pPr>
               <w:spacing w:after="60" w:line="252" w:lineRule="auto"/>
               <w:ind w:firstLine="420"/>
+              <w:rPr>
+                <w:rFonts w:hint="eastAsia"/>
+              </w:rPr>
             </w:pPr>
             <w:r>
               <w:rPr>
@@ -813,6 +904,9 @@
             <w:pPr>
               <w:spacing w:after="60" w:line="252" w:lineRule="auto"/>
               <w:ind w:firstLine="420"/>
+              <w:rPr>
+                <w:rFonts w:hint="eastAsia"/>
+              </w:rPr>
             </w:pPr>
             <w:r>
               <w:rPr>
@@ -825,6 +919,9 @@
             <w:pPr>
               <w:spacing w:after="60" w:line="252" w:lineRule="auto"/>
               <w:ind w:firstLine="420"/>
+              <w:rPr>
+                <w:rFonts w:hint="eastAsia"/>
+              </w:rPr>
             </w:pPr>
             <w:r>
               <w:rPr>
@@ -837,6 +934,9 @@
             <w:pPr>
               <w:spacing w:after="60" w:line="252" w:lineRule="auto"/>
               <w:ind w:firstLine="420"/>
+              <w:rPr>
+                <w:rFonts w:hint="eastAsia"/>
+              </w:rPr>
             </w:pPr>
             <w:r>
               <w:rPr>
@@ -849,6 +949,9 @@
             <w:pPr>
               <w:spacing w:after="60" w:line="252" w:lineRule="auto"/>
               <w:ind w:firstLine="420"/>
+              <w:rPr>
+                <w:rFonts w:hint="eastAsia"/>
+              </w:rPr>
             </w:pPr>
             <w:r>
               <w:t>系统开发流程按照需求分析、概要设计、数据库设计、接口设计、编码实现、联调测试和文档整理推进。测试重点包括登录注册、活动发布、活动报名、重复报名限制、组织关联、积分审核、重复加分限制和 AI 问答接口等。</w:t>
@@ -858,6 +961,9 @@
             <w:pPr>
               <w:spacing w:after="60" w:line="252" w:lineRule="auto"/>
               <w:ind w:firstLine="420"/>
+              <w:rPr>
+                <w:rFonts w:hint="eastAsia"/>
+              </w:rPr>
             </w:pPr>
             <w:r>
               <w:rPr>
@@ -871,10 +977,7 @@
               <w:spacing w:after="60" w:line="252" w:lineRule="auto"/>
             </w:pPr>
             <w:r>
-              <w:rPr>
-                <w:rFonts w:hint="eastAsia"/>
-              </w:rPr>
-              <w:t>活动全生命周期管理模块</w:t>
+              <w:t>校园活动管理模块</w:t>
             </w:r>
             <w:r>
               <w:rPr>
@@ -883,21 +986,16 @@
               <w:t>：</w:t>
             </w:r>
             <w:r>
-              <w:rPr>
-                <w:rFonts w:hint="eastAsia"/>
-              </w:rPr>
-              <w:t>前端包含活动列表页（支持分类、时间、状态筛选与分页）、活动详情页、活动发布 / 编辑表单页、报名名单管理弹窗；实现报名按钮状态动态渲染，根据活动阶段展示 “未开始”“报名中”“已截止”“名额已满”“已报名” 等不同状态。后端提供活动增删改查、报名提交、报名取消、报名名单查询等标准化 RESTful 接口；内置三大核心业务校验逻辑：重复报名校验、报名截止时间校验、名额余量校验；实现活动状态变更与报名权限的联动控制。</w:t>
-            </w:r>
-          </w:p>
-          <w:p>
-            <w:pPr>
-              <w:spacing w:after="60" w:line="252" w:lineRule="auto"/>
-            </w:pPr>
-            <w:r>
-              <w:rPr>
-                <w:rFonts w:hint="eastAsia"/>
-              </w:rPr>
-              <w:t>学生组织主体治理模块</w:t>
+              <w:br/>
+              <w:t>实现校园活动的发布、编辑、查询、报名、签到及统计等功能。系统支持活动分类查询、报名截止控制、名额限制及重复报名校验，实现活动全生命周期管理。</w:t>
+            </w:r>
+          </w:p>
+          <w:p>
+            <w:pPr>
+              <w:spacing w:after="60" w:line="252" w:lineRule="auto"/>
+            </w:pPr>
+            <w:r>
+              <w:t>学生组织管理模块</w:t>
             </w:r>
             <w:r>
               <w:rPr>
@@ -906,28 +1004,55 @@
               <w:t>：</w:t>
             </w:r>
             <w:r>
-              <w:rPr>
-                <w:rFonts w:hint="eastAsia"/>
-              </w:rPr>
-              <w:t>前端包含组织名录页、组织详情页、组织信息编辑表单、组织负责人设置弹窗；管理员端支持全量组织统一管理，学生端支持组织信息与对应活动的公开查看。后端提供组织信息 CRUD、负责人权限分配、组织活动关联查询、组织状态变更等接口；实现负责人角色的数据范围控制，确保组织负责人仅可管理所属组织的活动与积分业</w:t>
-            </w:r>
-            <w:r>
-              <w:rPr>
-                <w:rFonts w:hint="eastAsia"/>
-              </w:rPr>
+              <w:br/>
+              <w:t>实现学生组织信息维护、负责人管理、组织成员管理及组织活动管理等功能。管理员负责组织创建与维护，组织负责人负责所属组织活动及成员管理，实现组织数据权限隔离。</w:t>
+            </w:r>
+          </w:p>
+          <w:p>
+            <w:pPr>
+              <w:spacing w:after="60" w:line="252" w:lineRule="auto"/>
+            </w:pPr>
+            <w:r>
+              <w:t>综合测评积分管理模块</w:t>
+            </w:r>
+            <w:r>
+              <w:rPr>
+                <w:rFonts w:hint="eastAsia"/>
+              </w:rPr>
+              <w:t>：</w:t>
+            </w:r>
+            <w:r>
+              <w:br/>
+              <w:t>实现积分规则配置、加分申请、积分审核、积分统计及个人积分查询等功能。系统通过唯一约束防止重复加分，并完成积分审核流程控制，提高综合测评管理效率。</w:t>
+            </w:r>
+          </w:p>
+          <w:p>
+            <w:pPr>
+              <w:spacing w:after="60" w:line="252" w:lineRule="auto"/>
+            </w:pPr>
+            <w:r>
+              <w:t>校园事务协同模块</w:t>
+            </w:r>
+            <w:r>
+              <w:rPr>
+                <w:rFonts w:hint="eastAsia"/>
+              </w:rPr>
+              <w:t>：</w:t>
+            </w:r>
+            <w:r>
+              <w:br/>
+            </w:r>
+            <w:r>
               <w:lastRenderedPageBreak/>
-              <w:t>务。</w:t>
-            </w:r>
-          </w:p>
-          <w:p>
-            <w:pPr>
-              <w:spacing w:after="60" w:line="252" w:lineRule="auto"/>
-            </w:pPr>
-            <w:r>
-              <w:rPr>
-                <w:rFonts w:hint="eastAsia"/>
-              </w:rPr>
-              <w:t>综测学分全链路管控模块</w:t>
+              <w:t>新增校园事务申请与审批功能，实现事务类型管理、校园资源管理、事务申请提交、审批办理及办理结果查询。支持场地借用、设备申请、活动审批等业务，实现校园事务线上流转。</w:t>
+            </w:r>
+          </w:p>
+          <w:p>
+            <w:pPr>
+              <w:spacing w:after="60" w:line="252" w:lineRule="auto"/>
+            </w:pPr>
+            <w:r>
+              <w:t>消息通知模块</w:t>
             </w:r>
             <w:r>
               <w:rPr>
@@ -936,21 +1061,16 @@
               <w:t>：</w:t>
             </w:r>
             <w:r>
-              <w:rPr>
-                <w:rFonts w:hint="eastAsia"/>
-              </w:rPr>
-              <w:t>前端包含积分规则配置页、加分申请提交页、积分审核列表页、个人积分中心页（含总分概览与明细列表）；支持按学期、活动类型、审核状态筛选积分记录。后端提供积分规则管理、加分申请提交、积分审核、个人积分查询等接口；通过数据库联合唯一约束实现 “单用户 + 单活动” 重复加分拦截；实现待审核、已通过、已驳回三种状态的流转校验，状态不可逆篡改。</w:t>
-            </w:r>
-          </w:p>
-          <w:p>
-            <w:pPr>
-              <w:spacing w:after="60" w:line="252" w:lineRule="auto"/>
-            </w:pPr>
-            <w:r>
-              <w:rPr>
-                <w:rFonts w:hint="eastAsia"/>
-              </w:rPr>
-              <w:t>领域知识智能问答模块</w:t>
+              <w:br/>
+              <w:t>新增统一消息中心，实现公告发布、活动通知、报名提醒、积分审核通知、事务审批通知等功能。系统支持消息分类、已读未读状态管理及历史消息查询，提高信息传递效率。</w:t>
+            </w:r>
+          </w:p>
+          <w:p>
+            <w:pPr>
+              <w:spacing w:after="60" w:line="252" w:lineRule="auto"/>
+            </w:pPr>
+            <w:r>
+              <w:t>活动反馈模块</w:t>
             </w:r>
             <w:r>
               <w:rPr>
@@ -959,16 +1079,35 @@
               <w:t>：</w:t>
             </w:r>
             <w:r>
-              <w:rPr>
-                <w:rFonts w:hint="eastAsia"/>
-              </w:rPr>
-              <w:t>搭建 AI 对话交互页，支持问题输入、回答展示、历史问答记录列表；模拟对话式交互体验，提供常见问题快捷提问入口。后端构建独立问答服务层，接收用户问题后检索对应用户的活动报名、积分、近期可报名活动等业务数据，按照预设模板拼接为领域化 Prompt；封装大模型 API 调用逻辑，统一处理鉴权、超时、异常重试；将问答对持久化存储，用于后续审计与效果优化。</w:t>
-            </w:r>
-          </w:p>
-          <w:p>
-            <w:pPr>
-              <w:spacing w:after="60" w:line="252" w:lineRule="auto"/>
-              <w:ind w:firstLine="420"/>
+              <w:br/>
+              <w:t>活动结束后开放反馈入口，学生可提交活动评价、满意度评分及意见建议；组织负责人和管理员可查看反馈统计结果，为活动质量改进提供数据支持，形成活动管理闭环。</w:t>
+            </w:r>
+          </w:p>
+          <w:p>
+            <w:pPr>
+              <w:spacing w:after="60" w:line="252" w:lineRule="auto"/>
+            </w:pPr>
+            <w:r>
+              <w:t>AI 智能问答模块</w:t>
+            </w:r>
+            <w:r>
+              <w:rPr>
+                <w:rFonts w:hint="eastAsia"/>
+              </w:rPr>
+              <w:t>：</w:t>
+            </w:r>
+            <w:r>
+              <w:br/>
+              <w:t>结合大语言模型接口，实现校园业务智能咨询服务。系统根据用户身份及业务数据，为用户提供活动报名、积分查询、组织信息、事务办理等个性化问答服务，并保存问答记录用于后续分析与优化。</w:t>
+            </w:r>
+          </w:p>
+          <w:p>
+            <w:pPr>
+              <w:spacing w:after="60" w:line="252" w:lineRule="auto"/>
+              <w:ind w:firstLine="420"/>
+              <w:rPr>
+                <w:rFonts w:hint="eastAsia"/>
+              </w:rPr>
             </w:pPr>
             <w:r>
               <w:rPr>
@@ -987,6 +1126,9 @@
             <w:pPr>
               <w:spacing w:after="60" w:line="252" w:lineRule="auto"/>
               <w:ind w:firstLine="420"/>
+              <w:rPr>
+                <w:rFonts w:hint="eastAsia"/>
+              </w:rPr>
             </w:pPr>
             <w:r>
               <w:rPr>
@@ -1017,6 +1159,9 @@
             <w:pPr>
               <w:spacing w:after="60" w:line="252" w:lineRule="auto"/>
               <w:ind w:firstLine="420"/>
+              <w:rPr>
+                <w:rFonts w:hint="eastAsia"/>
+              </w:rPr>
             </w:pPr>
             <w:r>
               <w:rPr>
@@ -1029,6 +1174,9 @@
             <w:pPr>
               <w:spacing w:after="60" w:line="252" w:lineRule="auto"/>
               <w:ind w:firstLine="420"/>
+              <w:rPr>
+                <w:rFonts w:hint="eastAsia"/>
+              </w:rPr>
             </w:pPr>
             <w:r>
               <w:rPr>
@@ -1041,6 +1189,9 @@
             <w:pPr>
               <w:spacing w:after="60" w:line="252" w:lineRule="auto"/>
               <w:ind w:firstLine="420"/>
+              <w:rPr>
+                <w:rFonts w:hint="eastAsia"/>
+              </w:rPr>
             </w:pPr>
             <w:r>
               <w:rPr>
@@ -1053,6 +1204,9 @@
             <w:pPr>
               <w:spacing w:after="60" w:line="252" w:lineRule="auto"/>
               <w:ind w:firstLine="420"/>
+              <w:rPr>
+                <w:rFonts w:hint="eastAsia"/>
+              </w:rPr>
             </w:pPr>
             <w:r>
               <w:rPr>
@@ -1065,6 +1219,9 @@
             <w:pPr>
               <w:spacing w:after="60" w:line="252" w:lineRule="auto"/>
               <w:ind w:firstLine="420"/>
+              <w:rPr>
+                <w:rFonts w:hint="eastAsia"/>
+              </w:rPr>
             </w:pPr>
             <w:r>
               <w:rPr>
@@ -1077,6 +1234,9 @@
             <w:pPr>
               <w:spacing w:after="60" w:line="252" w:lineRule="auto"/>
               <w:ind w:firstLine="420"/>
+              <w:rPr>
+                <w:rFonts w:hint="eastAsia"/>
+              </w:rPr>
             </w:pPr>
             <w:r>
               <w:rPr>
@@ -1089,6 +1249,9 @@
             <w:pPr>
               <w:spacing w:after="60" w:line="252" w:lineRule="auto"/>
               <w:ind w:firstLine="420"/>
+              <w:rPr>
+                <w:rFonts w:hint="eastAsia"/>
+              </w:rPr>
             </w:pPr>
             <w:r>
               <w:rPr>
@@ -1100,6 +1263,9 @@
           <w:p>
             <w:pPr>
               <w:spacing w:after="60" w:line="252" w:lineRule="auto"/>
+              <w:rPr>
+                <w:rFonts w:hint="eastAsia"/>
+              </w:rPr>
             </w:pPr>
             <w:r>
               <w:rPr>
@@ -1114,16 +1280,68 @@
               <w:ind w:firstLine="420"/>
             </w:pPr>
             <w:r>
-              <w:t>本课设预期建成一套可运行、可演示的智慧校园综测服务与智能治理平台原型，可在浏览器端完整覆盖学生端与管理端核心业务流程，交付物包含前端工程源码、后端服务接口、MySQL 数据库脚本、初始化测试数据、功能测试截图与系统运行说明文档。</w:t>
-            </w:r>
-          </w:p>
-          <w:p>
-            <w:pPr>
-              <w:spacing w:after="60" w:line="252" w:lineRule="auto"/>
-              <w:ind w:firstLine="420"/>
-            </w:pPr>
-            <w:r>
-              <w:t>平台特色主要体现在三个维度：第一，采用模块化松耦合架构设计，围绕活动治理、组织治理、学分治理与智能交互四大模块构建业务体系，功能边界清晰、权责划分明确，避免单一报名功能的过度冗余设计。第二，实现活动 - 组织 - 学分的多维度数据联动，业务流程高度契合高校校园活动管理与综测认定的真实治理场景，具备较强的落地适配性。第三，融合生成式人工智能技术，打造基于业务数据的智能问答服务，实现平台从 “工具型管理系统” 向 “智慧化服务平台” 的升级，具备一定的技术创新性与展示价值</w:t>
+              <w:t>本课题预期完成一套可运行、可演示的智慧校园综测服务与智能治理平台原型系统，实现校园活动管理、学生组织管理、综合测评积分管理、校园事务协同、消息通知、活动反馈及 AI 智能问答等核心业务功能，能够完整覆盖学生端、组织负责人端和管理员端的主要业务流程。系统交付成果包括前端工程源码、后端服务源码、MySQL 数据库脚本、初始化测试数据、系统运行部署文档、功能测试文档及系统演示材料，能够满足项目展示和功能验证的要求。</w:t>
+            </w:r>
+          </w:p>
+          <w:p>
+            <w:pPr>
+              <w:spacing w:after="60" w:line="252" w:lineRule="auto"/>
+              <w:ind w:firstLine="420"/>
+            </w:pPr>
+            <w:r>
+              <w:t>本平台具有以下几个方面的特色：</w:t>
+            </w:r>
+          </w:p>
+          <w:p>
+            <w:pPr>
+              <w:spacing w:after="60" w:line="252" w:lineRule="auto"/>
+              <w:ind w:firstLine="420"/>
+            </w:pPr>
+            <w:r>
+              <w:t>（1）构建校园综合治理一体化平台。 在原有校园活动管理、组织管理和综合测评积</w:t>
+            </w:r>
+            <w:r>
+              <w:lastRenderedPageBreak/>
+              <w:t>分管理的基础上，新增校园事务协同、消息通知和活动反馈等功能模块，实现校园活动组织、事务审批、信息发布、综合测评及反馈评价等业务的统一管理，形成覆盖校园活动全过程的综合服务平台，提高校园事务管理效率。</w:t>
+            </w:r>
+          </w:p>
+          <w:p>
+            <w:pPr>
+              <w:spacing w:after="60" w:line="252" w:lineRule="auto"/>
+              <w:ind w:firstLine="420"/>
+            </w:pPr>
+            <w:r>
+              <w:t>（2）实现多业务模块数据协同与业务闭环。 系统建立活动、组织、积分、事务、通知及反馈等业务之间的数据关联关系，实现活动报名、积分认定、事务审批、消息提醒和活动评价等业务流程的自动衔接，形成“活动发布—学生报名—事务协同—消息通知—积分认定—活动反馈”的完整业务闭环，符合高校校园综合治理的实际需求。</w:t>
+            </w:r>
+          </w:p>
+          <w:p>
+            <w:pPr>
+              <w:spacing w:after="60" w:line="252" w:lineRule="auto"/>
+              <w:ind w:firstLine="420"/>
+            </w:pPr>
+            <w:r>
+              <w:t>（3）采用模块化、分层化系统架构。 平台采用前后端分离和分层架构设计，各业务模块之间相互独立、低耦合，便于后续系统维护与功能扩展；结合 Spring Security 与 JWT 实现统一身份认证和权限控制，提高系统安全性和可维护性。</w:t>
+            </w:r>
+          </w:p>
+          <w:p>
+            <w:pPr>
+              <w:spacing w:after="60" w:line="252" w:lineRule="auto"/>
+              <w:ind w:firstLine="420"/>
+            </w:pPr>
+            <w:r>
+              <w:t>（4）融合人工智能提升智慧服务能力。 平台集成生成式人工智能技术，结合用户活动、积分、事务办理等业务数据，为用户提供智能问答、信息查询及业务咨询服务，实现校园管理平台由传统业务处理向智慧服务平台的升级，提高系统智能化水平和用户体验。</w:t>
+            </w:r>
+          </w:p>
+          <w:p>
+            <w:pPr>
+              <w:spacing w:after="60" w:line="252" w:lineRule="auto"/>
+              <w:ind w:firstLine="420"/>
+              <w:rPr>
+                <w:rFonts w:hint="eastAsia"/>
+              </w:rPr>
+            </w:pPr>
+            <w:r>
+              <w:t>（5）具备良好的工程实践价值。 系统采用 Vue3、Spring Boot、MyBatis-Plus、MySQL 等主流开发技术进行实现，具有较好的可扩展性、可维护性和实际应用价值，可为高校校园活动管理、综合测评管理及校园事务数字化建设提供参考</w:t>
             </w:r>
             <w:r>
               <w:rPr>
@@ -1153,6 +1371,9 @@
           <w:p>
             <w:pPr>
               <w:spacing w:after="60" w:line="252" w:lineRule="auto"/>
+              <w:rPr>
+                <w:rFonts w:hint="eastAsia"/>
+              </w:rPr>
             </w:pPr>
             <w:r>
               <w:rPr>
@@ -1166,6 +1387,9 @@
             <w:pPr>
               <w:spacing w:after="60" w:line="252" w:lineRule="auto"/>
               <w:ind w:firstLine="420"/>
+              <w:rPr>
+                <w:rFonts w:hint="eastAsia"/>
+              </w:rPr>
             </w:pPr>
             <w:r>
               <w:t>本系统功能范围以“模块清楚、页面适中、可完成可演示”为原则，主要实现活动管理、组织管理、积分管理和 AI 智能助手四个核心模块，同时配套登录注册、角色权限、数据库约束、接口测试和运行说明。</w:t>
@@ -1174,6 +1398,9 @@
           <w:p>
             <w:pPr>
               <w:spacing w:after="60" w:line="252" w:lineRule="auto"/>
+              <w:rPr>
+                <w:rFonts w:hint="eastAsia"/>
+              </w:rPr>
             </w:pPr>
             <w:r>
               <w:rPr>
@@ -1186,6 +1413,9 @@
             <w:pPr>
               <w:spacing w:after="60" w:line="252" w:lineRule="auto"/>
               <w:ind w:firstLine="420"/>
+              <w:rPr>
+                <w:rFonts w:hint="eastAsia"/>
+              </w:rPr>
             </w:pPr>
             <w:r>
               <w:t>活动管理模块：实现活动发布、修改、下架、列表展示、详情查看、报名、取消报名和报名名单查看等功能。该模块是系统基础模块，报名功能作为其中的一个业务环节实现。</w:t>
@@ -1195,6 +1425,9 @@
             <w:pPr>
               <w:spacing w:after="60" w:line="252" w:lineRule="auto"/>
               <w:ind w:firstLine="420"/>
+              <w:rPr>
+                <w:rFonts w:hint="eastAsia"/>
+              </w:rPr>
             </w:pPr>
             <w:r>
               <w:t>组织管理模块：实现组织信息维护、组织列表、负责人权限、按组织查看活动等功能。系统中的活动均可关联到具体组织。</w:t>
@@ -1204,6 +1437,9 @@
             <w:pPr>
               <w:spacing w:after="60" w:line="252" w:lineRule="auto"/>
               <w:ind w:firstLine="420"/>
+              <w:rPr>
+                <w:rFonts w:hint="eastAsia"/>
+              </w:rPr>
             </w:pPr>
             <w:r>
               <w:t>积分管理模块：实现积分规则维护、活动加分、积分审核、积分记录查询和个人积分明细展示等功能。系统需要限制重复加分，并保留审核状态。</w:t>
@@ -1224,12 +1460,52 @@
               <w:ind w:firstLine="420"/>
             </w:pPr>
             <w:r>
+              <w:t>校园事务协同模块：实现事务类型管理、校园资源管理、事务申请、事务审批、办理进度查询及事务状态管理等功能。支持场地申请、设备借用、活动审批等校园事务，实现</w:t>
+            </w:r>
+            <w:r>
+              <w:lastRenderedPageBreak/>
+              <w:t>事务办理全过程线上流转。</w:t>
+            </w:r>
+          </w:p>
+          <w:p>
+            <w:pPr>
+              <w:spacing w:after="60" w:line="252" w:lineRule="auto"/>
+              <w:ind w:firstLine="420"/>
+            </w:pPr>
+            <w:r>
+              <w:t>消息通知模块：实现系统公告发布、活动通知、报名提醒、积分审核通知、事务审批通知及消息中心等功能。系统支持消息分类、已读未读状态管理及历史消息查询，实现统一的信息推送服务。</w:t>
+            </w:r>
+          </w:p>
+          <w:p>
+            <w:pPr>
+              <w:spacing w:after="60" w:line="252" w:lineRule="auto"/>
+              <w:ind w:firstLine="420"/>
+              <w:rPr>
+                <w:rFonts w:hint="eastAsia"/>
+              </w:rPr>
+            </w:pPr>
+            <w:r>
+              <w:t>活动反馈模块：实现活动评价、满意度评分、意见反馈、反馈统计及活动质量分析等功能。学生可提交活动评价，组织负责人和管理员可查看统计分析结果，为活动持续改进提供依据，形成活动管理闭环。</w:t>
+            </w:r>
+          </w:p>
+          <w:p>
+            <w:pPr>
+              <w:spacing w:after="60" w:line="252" w:lineRule="auto"/>
+              <w:ind w:firstLine="420"/>
+              <w:rPr>
+                <w:rFonts w:hint="eastAsia"/>
+              </w:rPr>
+            </w:pPr>
+            <w:r>
               <w:t>基础支撑功能：实现用户登录注册、角色识别、权限控制、首页统计、数据库初始化脚本、接口测试和部署配置。</w:t>
             </w:r>
           </w:p>
           <w:p>
             <w:pPr>
               <w:spacing w:after="60" w:line="252" w:lineRule="auto"/>
+              <w:rPr>
+                <w:rFonts w:hint="eastAsia"/>
+              </w:rPr>
             </w:pPr>
             <w:r>
               <w:rPr>
@@ -1242,6 +1518,9 @@
             <w:pPr>
               <w:spacing w:after="60" w:line="252" w:lineRule="auto"/>
               <w:ind w:firstLine="420"/>
+              <w:rPr>
+                <w:rFonts w:hint="eastAsia"/>
+              </w:rPr>
             </w:pPr>
             <w:r>
               <w:t>系统预计实现 7 个主要页面，尽量使用综合页面和标签页，避免把每个小功能都拆成单独页面：</w:t>
@@ -1251,6 +1530,9 @@
             <w:pPr>
               <w:spacing w:after="60" w:line="252" w:lineRule="auto"/>
               <w:ind w:firstLine="420"/>
+              <w:rPr>
+                <w:rFonts w:hint="eastAsia"/>
+              </w:rPr>
             </w:pPr>
             <w:r>
               <w:t>登录 / 注册页面。</w:t>
@@ -1260,6 +1542,9 @@
             <w:pPr>
               <w:spacing w:after="60" w:line="252" w:lineRule="auto"/>
               <w:ind w:firstLine="420"/>
+              <w:rPr>
+                <w:rFonts w:hint="eastAsia"/>
+              </w:rPr>
             </w:pPr>
             <w:r>
               <w:t>学生首页页面：展示近期活动、个人报名数量、个人积分概览和功能入口。</w:t>
@@ -1269,6 +1554,9 @@
             <w:pPr>
               <w:spacing w:after="60" w:line="252" w:lineRule="auto"/>
               <w:ind w:firstLine="420"/>
+              <w:rPr>
+                <w:rFonts w:hint="eastAsia"/>
+              </w:rPr>
             </w:pPr>
             <w:r>
               <w:t>活动中心页面：集中完成活动列表、活动详情、报名和取消报名操作。</w:t>
@@ -1289,6 +1577,30 @@
               <w:ind w:firstLine="420"/>
             </w:pPr>
             <w:r>
+              <w:t>校园事务页面：实现事务申请、办理进度查询、审批结果查看及校园资源预约等功能。</w:t>
+            </w:r>
+          </w:p>
+          <w:p>
+            <w:pPr>
+              <w:spacing w:after="60" w:line="252" w:lineRule="auto"/>
+              <w:ind w:firstLine="420"/>
+              <w:rPr>
+                <w:rFonts w:hint="eastAsia"/>
+              </w:rPr>
+            </w:pPr>
+            <w:r>
+              <w:t>消息通知页面：展示系统公告、活动通知、审批通知、积分通知等消息，并支持消息已读管理。</w:t>
+            </w:r>
+          </w:p>
+          <w:p>
+            <w:pPr>
+              <w:spacing w:after="60" w:line="252" w:lineRule="auto"/>
+              <w:ind w:firstLine="420"/>
+              <w:rPr>
+                <w:rFonts w:hint="eastAsia"/>
+              </w:rPr>
+            </w:pPr>
+            <w:r>
               <w:t>我的活动与积分页面：展示我的报名记录、参与状态、积分总分和积分明细。</w:t>
             </w:r>
           </w:p>
@@ -1296,6 +1608,9 @@
             <w:pPr>
               <w:spacing w:after="60" w:line="252" w:lineRule="auto"/>
               <w:ind w:firstLine="420"/>
+              <w:rPr>
+                <w:rFonts w:hint="eastAsia"/>
+              </w:rPr>
             </w:pPr>
             <w:r>
               <w:t>AI 智能助手页面：学生输入问题，系统返回基于活动和积分数据的回答。</w:t>
@@ -1313,6 +1628,21 @@
           <w:p>
             <w:pPr>
               <w:spacing w:after="60" w:line="252" w:lineRule="auto"/>
+              <w:ind w:firstLine="420"/>
+              <w:rPr>
+                <w:rFonts w:hint="eastAsia"/>
+              </w:rPr>
+            </w:pPr>
+            <w:r>
+              <w:t>活动反馈统计页面：展示活动评价结果、满意度统计、反馈意见及活动质量分析，为管理员和组织负责人提供数据分析支持。</w:t>
+            </w:r>
+          </w:p>
+          <w:p>
+            <w:pPr>
+              <w:spacing w:after="60" w:line="252" w:lineRule="auto"/>
+              <w:rPr>
+                <w:rFonts w:hint="eastAsia"/>
+              </w:rPr>
             </w:pPr>
             <w:r>
               <w:rPr>
@@ -1327,21 +1657,24 @@
               <w:ind w:firstLine="420"/>
             </w:pPr>
             <w:r>
-              <w:t>系统预计设计 8 张核心数据表：user 用户表、organization 组织表、organization_member 组织成员表、activity 活动表、registration 报名表、score_rule 积分规则表、score_record 积分记录表、ai_qa_record AI 问答记录表。</w:t>
-            </w:r>
-          </w:p>
-          <w:p>
-            <w:pPr>
-              <w:spacing w:after="60" w:line="252" w:lineRule="auto"/>
-              <w:ind w:firstLine="420"/>
-            </w:pPr>
-            <w:r>
-              <w:t>数据库设计中将考虑主键、外键、联合唯一约束、非空约束和状态字段。报名表通过“用户编号 + 活动编号”限制重复报名，积分记录表通过“用户编号 + 活动编号”限制重复加分，活动表与组织表建立关联，积分记录表与活动表和用户表建立关联。</w:t>
-            </w:r>
-          </w:p>
-          <w:p>
-            <w:pPr>
-              <w:spacing w:after="60" w:line="252" w:lineRule="auto"/>
+              <w:t xml:space="preserve">系统预计设计 13 张核心数据表，分别为：user（用户表） organization（组织表） organization_member（组织成员表） activity（活动表） registration（活动报名表） score_rule（积分规则表） score_record（积分记录表） affair_type（事务类型表） campus_resource（校园资源表） affair_application（事务申请表） notice（公告表） activity_feedback（活动反馈表） ai_qa_record（AI 问答记录表） </w:t>
+            </w:r>
+          </w:p>
+          <w:p>
+            <w:pPr>
+              <w:spacing w:after="60" w:line="252" w:lineRule="auto"/>
+              <w:ind w:firstLine="420"/>
+            </w:pPr>
+            <w:r>
+              <w:t>数据库设计过程中考虑主键、外键、联合唯一约束、非空约束、状态字段及索引设计，保证系统数据完整性与一致性。其中，活动报名表通过"用户编号+活动编号"联合唯一约束限制重复报名；积分记录表通过"用户编号+活动编号"联合唯一约束限制重复加分；事务申请表关联事务类型、校园资源及申请用户，实现事务审批流程管理；活动反馈表关联活动和用户，实现活动评价数据管理；公告表用于统一管理校园公告及通知信息；各业务表之间建立完善的关联关系，共同支撑校园活动管理、综合测评、校园事务协同、消息通知、活动反馈及 AI 智能服务等核心业务功能。</w:t>
+            </w:r>
+          </w:p>
+          <w:p>
+            <w:pPr>
+              <w:spacing w:after="60" w:line="252" w:lineRule="auto"/>
+              <w:rPr>
+                <w:rFonts w:hint="eastAsia"/>
+              </w:rPr>
             </w:pPr>
             <w:r>
               <w:rPr>
@@ -1354,9 +1687,66 @@
             <w:pPr>
               <w:spacing w:after="60" w:line="252" w:lineRule="auto"/>
               <w:ind w:firstLine="420"/>
-            </w:pPr>
-            <w:r>
-              <w:t>总代码量初步估计为 4500 行左右。前端页面与组件代码约 2000 行，包括 Vue 页面、路由配置、接口请求封装、表单校验和页面样式。后端业务代码约 2200 行，包括 Controller、Service、Mapper、实体类、DTO、权限校验、活动业务、组织业务、积分业务和 AI 问答接口。数据库 SQL 脚本约 200 行，测试与配置代码约 100 到 200 行。</w:t>
+              <w:rPr>
+                <w:rFonts w:hint="eastAsia"/>
+              </w:rPr>
+            </w:pPr>
+            <w:r>
+              <w:t xml:space="preserve">总代码量初步估计为 </w:t>
+            </w:r>
+            <w:r>
+              <w:rPr>
+                <w:rFonts w:hint="eastAsia"/>
+              </w:rPr>
+              <w:t>7</w:t>
+            </w:r>
+            <w:r>
+              <w:t xml:space="preserve">500 行左右。前端页面与组件代码约 </w:t>
+            </w:r>
+            <w:r>
+              <w:rPr>
+                <w:rFonts w:hint="eastAsia"/>
+              </w:rPr>
+              <w:t>30</w:t>
+            </w:r>
+            <w:r>
+              <w:t xml:space="preserve">00 行，包括 Vue 页面、路由配置、接口请求封装、表单校验和页面样式。后端业务代码约 </w:t>
+            </w:r>
+            <w:r>
+              <w:rPr>
+                <w:rFonts w:hint="eastAsia"/>
+              </w:rPr>
+              <w:t>37</w:t>
+            </w:r>
+            <w:r>
+              <w:t xml:space="preserve">00 行，包括 Controller、Service、Mapper、实体类、DTO、权限校验、活动业务、组织业务、积分业务和 AI 问答接口。数据库 SQL 脚本约 </w:t>
+            </w:r>
+            <w:r>
+              <w:rPr>
+                <w:rFonts w:hint="eastAsia"/>
+              </w:rPr>
+              <w:t>4</w:t>
+            </w:r>
+            <w:r>
+              <w:t xml:space="preserve">00 行，测试与配置代码约 </w:t>
+            </w:r>
+            <w:r>
+              <w:rPr>
+                <w:rFonts w:hint="eastAsia"/>
+              </w:rPr>
+              <w:t>4</w:t>
+            </w:r>
+            <w:r>
+              <w:t xml:space="preserve">00 到 </w:t>
+            </w:r>
+            <w:r>
+              <w:rPr>
+                <w:rFonts w:hint="eastAsia"/>
+              </w:rPr>
+              <w:t>5</w:t>
+            </w:r>
+            <w:r>
+              <w:t>00 行。</w:t>
             </w:r>
           </w:p>
         </w:tc>
@@ -1380,6 +1770,7 @@
           <w:p>
             <w:pPr>
               <w:rPr>
+                <w:rFonts w:hint="eastAsia"/>
                 <w:sz w:val="28"/>
                 <w:szCs w:val="28"/>
               </w:rPr>
@@ -1422,6 +1813,9 @@
                 <w:p>
                   <w:pPr>
                     <w:spacing w:line="228" w:lineRule="auto"/>
+                    <w:rPr>
+                      <w:rFonts w:hint="eastAsia"/>
+                    </w:rPr>
                   </w:pPr>
                   <w:r>
                     <w:rPr>
@@ -1440,6 +1834,9 @@
                 <w:p>
                   <w:pPr>
                     <w:spacing w:line="228" w:lineRule="auto"/>
+                    <w:rPr>
+                      <w:rFonts w:hint="eastAsia"/>
+                    </w:rPr>
                   </w:pPr>
                   <w:r>
                     <w:rPr>
@@ -1458,6 +1855,9 @@
                 <w:p>
                   <w:pPr>
                     <w:spacing w:line="228" w:lineRule="auto"/>
+                    <w:rPr>
+                      <w:rFonts w:hint="eastAsia"/>
+                    </w:rPr>
                   </w:pPr>
                   <w:r>
                     <w:rPr>
@@ -1478,6 +1878,9 @@
                 <w:p>
                   <w:pPr>
                     <w:spacing w:line="228" w:lineRule="auto"/>
+                    <w:rPr>
+                      <w:rFonts w:hint="eastAsia"/>
+                    </w:rPr>
                   </w:pPr>
                   <w:r>
                     <w:rPr>
@@ -1495,6 +1898,9 @@
                 <w:p>
                   <w:pPr>
                     <w:spacing w:line="228" w:lineRule="auto"/>
+                    <w:rPr>
+                      <w:rFonts w:hint="eastAsia"/>
+                    </w:rPr>
                   </w:pPr>
                   <w:r>
                     <w:rPr>
@@ -1512,6 +1918,9 @@
                 <w:p>
                   <w:pPr>
                     <w:spacing w:line="228" w:lineRule="auto"/>
+                    <w:rPr>
+                      <w:rFonts w:hint="eastAsia"/>
+                    </w:rPr>
                   </w:pPr>
                   <w:r>
                     <w:rPr>
@@ -1531,6 +1940,9 @@
                 <w:p>
                   <w:pPr>
                     <w:spacing w:line="228" w:lineRule="auto"/>
+                    <w:rPr>
+                      <w:rFonts w:hint="eastAsia"/>
+                    </w:rPr>
                   </w:pPr>
                   <w:r>
                     <w:rPr>
@@ -1548,6 +1960,9 @@
                 <w:p>
                   <w:pPr>
                     <w:spacing w:line="228" w:lineRule="auto"/>
+                    <w:rPr>
+                      <w:rFonts w:hint="eastAsia"/>
+                    </w:rPr>
                   </w:pPr>
                   <w:r>
                     <w:rPr>
@@ -1565,6 +1980,9 @@
                 <w:p>
                   <w:pPr>
                     <w:spacing w:line="228" w:lineRule="auto"/>
+                    <w:rPr>
+                      <w:rFonts w:hint="eastAsia"/>
+                    </w:rPr>
                   </w:pPr>
                   <w:r>
                     <w:rPr>
@@ -1584,6 +2002,9 @@
                 <w:p>
                   <w:pPr>
                     <w:spacing w:line="228" w:lineRule="auto"/>
+                    <w:rPr>
+                      <w:rFonts w:hint="eastAsia"/>
+                    </w:rPr>
                   </w:pPr>
                   <w:r>
                     <w:rPr>
@@ -1601,6 +2022,9 @@
                 <w:p>
                   <w:pPr>
                     <w:spacing w:line="228" w:lineRule="auto"/>
+                    <w:rPr>
+                      <w:rFonts w:hint="eastAsia"/>
+                    </w:rPr>
                   </w:pPr>
                   <w:r>
                     <w:rPr>
@@ -1618,6 +2042,9 @@
                 <w:p>
                   <w:pPr>
                     <w:spacing w:line="228" w:lineRule="auto"/>
+                    <w:rPr>
+                      <w:rFonts w:hint="eastAsia"/>
+                    </w:rPr>
                   </w:pPr>
                   <w:r>
                     <w:rPr>
@@ -1637,6 +2064,9 @@
                 <w:p>
                   <w:pPr>
                     <w:spacing w:line="228" w:lineRule="auto"/>
+                    <w:rPr>
+                      <w:rFonts w:hint="eastAsia"/>
+                    </w:rPr>
                   </w:pPr>
                   <w:r>
                     <w:rPr>
@@ -1654,6 +2084,9 @@
                 <w:p>
                   <w:pPr>
                     <w:spacing w:line="228" w:lineRule="auto"/>
+                    <w:rPr>
+                      <w:rFonts w:hint="eastAsia"/>
+                    </w:rPr>
                   </w:pPr>
                   <w:r>
                     <w:rPr>
@@ -1671,6 +2104,9 @@
                 <w:p>
                   <w:pPr>
                     <w:spacing w:line="228" w:lineRule="auto"/>
+                    <w:rPr>
+                      <w:rFonts w:hint="eastAsia"/>
+                    </w:rPr>
                   </w:pPr>
                   <w:r>
                     <w:rPr>
@@ -1690,6 +2126,9 @@
                 <w:p>
                   <w:pPr>
                     <w:spacing w:line="228" w:lineRule="auto"/>
+                    <w:rPr>
+                      <w:rFonts w:hint="eastAsia"/>
+                    </w:rPr>
                   </w:pPr>
                   <w:r>
                     <w:rPr>
@@ -1707,6 +2146,9 @@
                 <w:p>
                   <w:pPr>
                     <w:spacing w:line="228" w:lineRule="auto"/>
+                    <w:rPr>
+                      <w:rFonts w:hint="eastAsia"/>
+                    </w:rPr>
                   </w:pPr>
                   <w:r>
                     <w:rPr>
@@ -1724,6 +2166,9 @@
                 <w:p>
                   <w:pPr>
                     <w:spacing w:line="228" w:lineRule="auto"/>
+                    <w:rPr>
+                      <w:rFonts w:hint="eastAsia"/>
+                    </w:rPr>
                   </w:pPr>
                   <w:r>
                     <w:rPr>
@@ -1743,6 +2188,9 @@
                 <w:p>
                   <w:pPr>
                     <w:spacing w:line="228" w:lineRule="auto"/>
+                    <w:rPr>
+                      <w:rFonts w:hint="eastAsia"/>
+                    </w:rPr>
                   </w:pPr>
                   <w:r>
                     <w:rPr>
@@ -1760,6 +2208,9 @@
                 <w:p>
                   <w:pPr>
                     <w:spacing w:line="228" w:lineRule="auto"/>
+                    <w:rPr>
+                      <w:rFonts w:hint="eastAsia"/>
+                    </w:rPr>
                   </w:pPr>
                   <w:r>
                     <w:rPr>
@@ -1777,6 +2228,9 @@
                 <w:p>
                   <w:pPr>
                     <w:spacing w:line="228" w:lineRule="auto"/>
+                    <w:rPr>
+                      <w:rFonts w:hint="eastAsia"/>
+                    </w:rPr>
                   </w:pPr>
                   <w:r>
                     <w:rPr>
@@ -1796,6 +2250,9 @@
                 <w:p>
                   <w:pPr>
                     <w:spacing w:line="228" w:lineRule="auto"/>
+                    <w:rPr>
+                      <w:rFonts w:hint="eastAsia"/>
+                    </w:rPr>
                   </w:pPr>
                   <w:r>
                     <w:rPr>
@@ -1813,6 +2270,9 @@
                 <w:p>
                   <w:pPr>
                     <w:spacing w:line="228" w:lineRule="auto"/>
+                    <w:rPr>
+                      <w:rFonts w:hint="eastAsia"/>
+                    </w:rPr>
                   </w:pPr>
                   <w:r>
                     <w:rPr>
@@ -1830,6 +2290,9 @@
                 <w:p>
                   <w:pPr>
                     <w:spacing w:line="228" w:lineRule="auto"/>
+                    <w:rPr>
+                      <w:rFonts w:hint="eastAsia"/>
+                    </w:rPr>
                   </w:pPr>
                   <w:r>
                     <w:rPr>
@@ -1849,6 +2312,9 @@
                 <w:p>
                   <w:pPr>
                     <w:spacing w:line="228" w:lineRule="auto"/>
+                    <w:rPr>
+                      <w:rFonts w:hint="eastAsia"/>
+                    </w:rPr>
                   </w:pPr>
                   <w:r>
                     <w:rPr>
@@ -1866,6 +2332,9 @@
                 <w:p>
                   <w:pPr>
                     <w:spacing w:line="228" w:lineRule="auto"/>
+                    <w:rPr>
+                      <w:rFonts w:hint="eastAsia"/>
+                    </w:rPr>
                   </w:pPr>
                   <w:r>
                     <w:rPr>
@@ -1883,6 +2352,9 @@
                 <w:p>
                   <w:pPr>
                     <w:spacing w:line="228" w:lineRule="auto"/>
+                    <w:rPr>
+                      <w:rFonts w:hint="eastAsia"/>
+                    </w:rPr>
                   </w:pPr>
                   <w:r>
                     <w:rPr>
@@ -1902,6 +2374,9 @@
                 <w:p>
                   <w:pPr>
                     <w:spacing w:line="228" w:lineRule="auto"/>
+                    <w:rPr>
+                      <w:rFonts w:hint="eastAsia"/>
+                    </w:rPr>
                   </w:pPr>
                   <w:r>
                     <w:rPr>
@@ -1919,6 +2394,9 @@
                 <w:p>
                   <w:pPr>
                     <w:spacing w:line="228" w:lineRule="auto"/>
+                    <w:rPr>
+                      <w:rFonts w:hint="eastAsia"/>
+                    </w:rPr>
                   </w:pPr>
                   <w:r>
                     <w:rPr>
@@ -1936,6 +2414,9 @@
                 <w:p>
                   <w:pPr>
                     <w:spacing w:line="228" w:lineRule="auto"/>
+                    <w:rPr>
+                      <w:rFonts w:hint="eastAsia"/>
+                    </w:rPr>
                   </w:pPr>
                   <w:r>
                     <w:rPr>
@@ -1951,6 +2432,7 @@
             <w:pPr>
               <w:ind w:firstLine="480"/>
               <w:rPr>
+                <w:rFonts w:hint="eastAsia"/>
                 <w:sz w:val="24"/>
               </w:rPr>
             </w:pPr>
@@ -1976,6 +2458,9 @@
           <w:p>
             <w:pPr>
               <w:spacing w:after="40"/>
+              <w:rPr>
+                <w:rFonts w:hint="eastAsia"/>
+              </w:rPr>
             </w:pPr>
             <w:r>
               <w:rPr>
@@ -1985,6 +2470,11 @@
             </w:r>
           </w:p>
           <w:p>
+            <w:pPr>
+              <w:rPr>
+                <w:rFonts w:hint="eastAsia"/>
+              </w:rPr>
+            </w:pPr>
             <w:r>
               <w:rPr>
                 <w:rFonts w:hint="eastAsia"/>
@@ -1998,84 +2488,72 @@
             </w:r>
           </w:p>
           <w:p>
+            <w:pPr>
+              <w:rPr>
+                <w:rFonts w:hint="eastAsia"/>
+              </w:rPr>
+            </w:pPr>
             <w:r>
               <w:rPr>
                 <w:rFonts w:hint="eastAsia"/>
                 <w:b/>
                 <w:bCs/>
               </w:rPr>
-              <w:t>成员</w:t>
-            </w:r>
+              <w:t>成员2</w:t>
+            </w:r>
+            <w:r>
+              <w:t xml:space="preserve">负责前端总体设计，页面风格、路由结构、公共组件、Element Plus 页面布局；同时负责活动管理模块，活动发布、修改、下架、活动列表、活动详情、报名、取消报名、报名名单 </w:t>
+            </w:r>
+          </w:p>
+          <w:p>
+            <w:pPr>
+              <w:rPr>
+                <w:rFonts w:hint="eastAsia"/>
+              </w:rPr>
+            </w:pPr>
             <w:r>
               <w:rPr>
                 <w:rFonts w:hint="eastAsia"/>
                 <w:b/>
                 <w:bCs/>
               </w:rPr>
-              <w:t>2</w:t>
-            </w:r>
-            <w:r>
-              <w:t xml:space="preserve">负责前端总体设计，页面风格、路由结构、公共组件、Element Plus 页面布局；同时负责活动管理模块，活动发布、修改、下架、活动列表、活动详情、报名、取消报名、报名名单 </w:t>
-            </w:r>
-          </w:p>
-          <w:p>
+              <w:t>成员3</w:t>
+            </w:r>
+            <w:r>
+              <w:t xml:space="preserve">负责数据库设计、数据字典初稿、主外键、完整性约束；同时负责组织管理模块，组织信息维护、组织列表、组织详情、负责人设置、组织状态管理、按组织查看活动 </w:t>
+            </w:r>
+          </w:p>
+          <w:p>
+            <w:pPr>
+              <w:rPr>
+                <w:rFonts w:hint="eastAsia"/>
+              </w:rPr>
+            </w:pPr>
             <w:r>
               <w:rPr>
                 <w:rFonts w:hint="eastAsia"/>
                 <w:b/>
                 <w:bCs/>
               </w:rPr>
-              <w:t>成员</w:t>
-            </w:r>
+              <w:t>成员4</w:t>
+            </w:r>
+            <w:r>
+              <w:t xml:space="preserve">负责后端业务逻辑实现及架构设计 ；同时负责积分管理模块，积分规则、活动加分申请、积分审核、积分记录查询、个人积分明细 </w:t>
+            </w:r>
+          </w:p>
+          <w:p>
+            <w:pPr>
+              <w:rPr>
+                <w:rFonts w:hint="eastAsia"/>
+              </w:rPr>
+            </w:pPr>
             <w:r>
               <w:rPr>
                 <w:rFonts w:hint="eastAsia"/>
                 <w:b/>
                 <w:bCs/>
               </w:rPr>
-              <w:t>3</w:t>
-            </w:r>
-            <w:r>
-              <w:t xml:space="preserve">负责数据库设计、数据字典初稿、主外键、完整性约束；同时负责组织管理模块，组织信息维护、组织列表、组织详情、负责人设置、组织状态管理、按组织查看活动 </w:t>
-            </w:r>
-          </w:p>
-          <w:p>
-            <w:r>
-              <w:rPr>
-                <w:rFonts w:hint="eastAsia"/>
-                <w:b/>
-                <w:bCs/>
-              </w:rPr>
-              <w:t>成员</w:t>
-            </w:r>
-            <w:r>
-              <w:rPr>
-                <w:rFonts w:hint="eastAsia"/>
-                <w:b/>
-                <w:bCs/>
-              </w:rPr>
-              <w:t>4</w:t>
-            </w:r>
-            <w:r>
-              <w:t xml:space="preserve">负责后端业务逻辑实现及架构设计 ；同时负责积分管理模块，积分规则、活动加分申请、积分审核、积分记录查询、个人积分明细 </w:t>
-            </w:r>
-          </w:p>
-          <w:p>
-            <w:r>
-              <w:rPr>
-                <w:rFonts w:hint="eastAsia"/>
-                <w:b/>
-                <w:bCs/>
-              </w:rPr>
-              <w:t>成员</w:t>
-            </w:r>
-            <w:r>
-              <w:rPr>
-                <w:rFonts w:hint="eastAsia"/>
-                <w:b/>
-                <w:bCs/>
-              </w:rPr>
-              <w:t>5</w:t>
+              <w:t>成员5</w:t>
             </w:r>
             <w:r>
               <w:t>负责 AI 问答页面、大模型 API 调用、Prompt 构造、问答记录保存；同时负责测试用例、完整性约束测试、运行截图、Bug 记录、AI 辅助开发记录整理</w:t>
@@ -2085,6 +2563,9 @@
             <w:pPr>
               <w:spacing w:before="40"/>
               <w:ind w:firstLine="420"/>
+              <w:rPr>
+                <w:rFonts w:hint="eastAsia"/>
+              </w:rPr>
             </w:pPr>
             <w:r>
               <w:t>小组成员通过 Git 进行代码版本管理，并在统一接口和数据库设计后完成联调测试。</w:t>
@@ -2094,6 +2575,11 @@
       </w:tr>
     </w:tbl>
     <w:p>
+      <w:pPr>
+        <w:rPr>
+          <w:rFonts w:hint="eastAsia"/>
+        </w:rPr>
+      </w:pPr>
       <w:r>
         <w:rPr>
           <w:sz w:val="22"/>
@@ -2119,6 +2605,11 @@
 <w:endnotes xmlns:wpc="http://schemas.microsoft.com/office/word/2010/wordprocessingCanvas" xmlns:cx="http://schemas.microsoft.com/office/drawing/2014/chartex" xmlns:cx1="http://schemas.microsoft.com/office/drawing/2015/9/8/chartex" xmlns:cx2="http://schemas.microsoft.com/office/drawing/2015/10/21/chartex" xmlns:cx3="http://schemas.microsoft.com/office/drawing/2016/5/9/chartex" xmlns:cx4="http://schemas.microsoft.com/office/drawing/2016/5/10/chartex" xmlns:cx5="http://schemas.microsoft.com/office/drawing/2016/5/11/chartex" xmlns:cx6="http://schemas.microsoft.com/office/drawing/2016/5/12/chartex" xmlns:cx7="http://schemas.microsoft.com/office/drawing/2016/5/13/chartex" xmlns:cx8="http://schemas.microsoft.com/office/drawing/2016/5/14/chartex" xmlns:mc="http://schemas.openxmlformats.org/markup-compatibility/2006" xmlns:aink="http://schemas.microsoft.com/office/drawing/2016/ink" xmlns:am3d="http://schemas.microsoft.com/office/drawing/2017/model3d" xmlns:o="urn:schemas-microsoft-com:office:office" xmlns:oel="http://schemas.microsoft.com/office/2019/extlst" xmlns:r="http://schemas.openxmlformats.org/officeDocument/2006/relationships" xmlns:m="http://schemas.openxmlformats.org/officeDocument/2006/math" xmlns:v="urn:schemas-microsoft-com:vml" xmlns:wp14="http://schemas.microsoft.com/office/word/2010/wordprocessingDrawing" xmlns:wp="http://schemas.openxmlformats.org/drawingml/2006/wordprocessingDrawing" xmlns:w10="urn:schemas-microsoft-com:office:word" xmlns:w="http://schemas.openxmlformats.org/wordprocessingml/2006/main" xmlns:w14="http://schemas.microsoft.com/office/word/2010/wordml" xmlns:w15="http://schemas.microsoft.com/office/word/2012/wordml" xmlns:w16cex="http://schemas.microsoft.com/office/word/2018/wordml/cex" xmlns:w16cid="http://schemas.microsoft.com/office/word/2016/wordml/cid" xmlns:w16="http://schemas.microsoft.com/office/word/2018/wordml" xmlns:w16du="http://schemas.microsoft.com/office/word/2023/wordml/word16du" xmlns:w16sdtdh="http://schemas.microsoft.com/office/word/2020/wordml/sdtdatahash" xmlns:w16sdtfl="http://schemas.microsoft.com/office/word/2024/wordml/sdtformatlock" xmlns:w16se="http://schemas.microsoft.com/office/word/2015/wordml/symex" xmlns:wpg="http://schemas.microsoft.com/office/word/2010/wordprocessingGroup" xmlns:wpi="http://schemas.microsoft.com/office/word/2010/wordprocessingInk" xmlns:wne="http://schemas.microsoft.com/office/word/2006/wordml" xmlns:wps="http://schemas.microsoft.com/office/word/2010/wordprocessingShape" mc:Ignorable="w14 w15 w16se w16cid w16 w16cex w16sdtdh w16sdtfl w16du wp14">
   <w:endnote w:type="separator" w:id="-1">
     <w:p>
+      <w:pPr>
+        <w:rPr>
+          <w:rFonts w:hint="eastAsia"/>
+        </w:rPr>
+      </w:pPr>
       <w:r>
         <w:separator/>
       </w:r>
@@ -2126,6 +2617,11 @@
   </w:endnote>
   <w:endnote w:type="continuationSeparator" w:id="0">
     <w:p>
+      <w:pPr>
+        <w:rPr>
+          <w:rFonts w:hint="eastAsia"/>
+        </w:rPr>
+      </w:pPr>
       <w:r>
         <w:continuationSeparator/>
       </w:r>
@@ -2139,9 +2635,13 @@
   <w:p>
     <w:pPr>
       <w:pStyle w:val="a7"/>
+      <w:rPr>
+        <w:rFonts w:hint="eastAsia"/>
+      </w:rPr>
     </w:pPr>
     <w:r>
       <w:rPr>
+        <w:rFonts w:hint="eastAsia"/>
         <w:noProof/>
       </w:rPr>
       <w:pict w14:anchorId="67110075">
@@ -2149,7 +2649,7 @@
           <v:stroke joinstyle="miter"/>
           <v:path gradientshapeok="t" o:connecttype="rect"/>
         </v:shapetype>
-        <v:shape id="文本框 1" o:spid="_x0000_s1025" type="#_x0000_t202" style="position:absolute;margin-left:0;margin-top:.05pt;width:19.9pt;height:10.35pt;z-index:1;visibility:visible;mso-wrap-style:square;mso-width-percent:0;mso-height-percent:0;mso-wrap-distance-left:0;mso-wrap-distance-top:0;mso-wrap-distance-right:0;mso-wrap-distance-bottom:0;mso-position-horizontal:center;mso-position-horizontal-relative:margin;mso-position-vertical:absolute;mso-position-vertical-relative:text;mso-width-percent:0;mso-height-percent:0;mso-width-relative:page;mso-height-relative:page;v-text-anchor:top" o:gfxdata="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" o:allowincell="f" stroked="f">
+        <v:shape id="文本框 1" o:spid="_x0000_s1025" type="#_x0000_t202" style="position:absolute;margin-left:0;margin-top:.05pt;width:19.9pt;height:10.35pt;z-index:1;visibility:visible;mso-wrap-style:square;mso-width-percent:0;mso-height-percent:0;mso-wrap-distance-left:0;mso-wrap-distance-top:0;mso-wrap-distance-right:0;mso-wrap-distance-bottom:0;mso-position-horizontal:center;mso-position-horizontal-relative:margin;mso-position-vertical:absolute;mso-position-vertical-relative:text;mso-width-percent:0;mso-height-percent:0;mso-width-relative:page;mso-height-relative:page;v-text-anchor:top" o:gfxdata="" o:allowincell="f" stroked="f">
           <v:fill opacity="0"/>
           <v:textbox inset="0,0,0,0">
             <w:txbxContent>
@@ -2158,6 +2658,7 @@
                   <w:pStyle w:val="a7"/>
                   <w:rPr>
                     <w:rStyle w:val="a3"/>
+                    <w:rFonts w:hint="eastAsia"/>
                   </w:rPr>
                 </w:pPr>
                 <w:r>
@@ -2217,6 +2718,11 @@
 <w:footnotes xmlns:wpc="http://schemas.microsoft.com/office/word/2010/wordprocessingCanvas" xmlns:cx="http://schemas.microsoft.com/office/drawing/2014/chartex" xmlns:cx1="http://schemas.microsoft.com/office/drawing/2015/9/8/chartex" xmlns:cx2="http://schemas.microsoft.com/office/drawing/2015/10/21/chartex" xmlns:cx3="http://schemas.microsoft.com/office/drawing/2016/5/9/chartex" xmlns:cx4="http://schemas.microsoft.com/office/drawing/2016/5/10/chartex" xmlns:cx5="http://schemas.microsoft.com/office/drawing/2016/5/11/chartex" xmlns:cx6="http://schemas.microsoft.com/office/drawing/2016/5/12/chartex" xmlns:cx7="http://schemas.microsoft.com/office/drawing/2016/5/13/chartex" xmlns:cx8="http://schemas.microsoft.com/office/drawing/2016/5/14/chartex" xmlns:mc="http://schemas.openxmlformats.org/markup-compatibility/2006" xmlns:aink="http://schemas.microsoft.com/office/drawing/2016/ink" xmlns:am3d="http://schemas.microsoft.com/office/drawing/2017/model3d" xmlns:o="urn:schemas-microsoft-com:office:office" xmlns:oel="http://schemas.microsoft.com/office/2019/extlst" xmlns:r="http://schemas.openxmlformats.org/officeDocument/2006/relationships" xmlns:m="http://schemas.openxmlformats.org/officeDocument/2006/math" xmlns:v="urn:schemas-microsoft-com:vml" xmlns:wp14="http://schemas.microsoft.com/office/word/2010/wordprocessingDrawing" xmlns:wp="http://schemas.openxmlformats.org/drawingml/2006/wordprocessingDrawing" xmlns:w10="urn:schemas-microsoft-com:office:word" xmlns:w="http://schemas.openxmlformats.org/wordprocessingml/2006/main" xmlns:w14="http://schemas.microsoft.com/office/word/2010/wordml" xmlns:w15="http://schemas.microsoft.com/office/word/2012/wordml" xmlns:w16cex="http://schemas.microsoft.com/office/word/2018/wordml/cex" xmlns:w16cid="http://schemas.microsoft.com/office/word/2016/wordml/cid" xmlns:w16="http://schemas.microsoft.com/office/word/2018/wordml" xmlns:w16du="http://schemas.microsoft.com/office/word/2023/wordml/word16du" xmlns:w16sdtdh="http://schemas.microsoft.com/office/word/2020/wordml/sdtdatahash" xmlns:w16sdtfl="http://schemas.microsoft.com/office/word/2024/wordml/sdtformatlock" xmlns:w16se="http://schemas.microsoft.com/office/word/2015/wordml/symex" xmlns:wpg="http://schemas.microsoft.com/office/word/2010/wordprocessingGroup" xmlns:wpi="http://schemas.microsoft.com/office/word/2010/wordprocessingInk" xmlns:wne="http://schemas.microsoft.com/office/word/2006/wordml" xmlns:wps="http://schemas.microsoft.com/office/word/2010/wordprocessingShape" mc:Ignorable="w14 w15 w16se w16cid w16 w16cex w16sdtdh w16sdtfl w16du wp14">
   <w:footnote w:type="separator" w:id="-1">
     <w:p>
+      <w:pPr>
+        <w:rPr>
+          <w:rFonts w:hint="eastAsia"/>
+        </w:rPr>
+      </w:pPr>
       <w:r>
         <w:separator/>
       </w:r>
@@ -2224,6 +2730,11 @@
   </w:footnote>
   <w:footnote w:type="continuationSeparator" w:id="0">
     <w:p>
+      <w:pPr>
+        <w:rPr>
+          <w:rFonts w:hint="eastAsia"/>
+        </w:rPr>
+      </w:pPr>
       <w:r>
         <w:continuationSeparator/>
       </w:r>
@@ -2235,6 +2746,155 @@
 <file path=word/numbering.xml><?xml version="1.0" encoding="utf-8"?>
 <w:numbering xmlns:wpc="http://schemas.microsoft.com/office/word/2010/wordprocessingCanvas" xmlns:cx="http://schemas.microsoft.com/office/drawing/2014/chartex" xmlns:cx1="http://schemas.microsoft.com/office/drawing/2015/9/8/chartex" xmlns:cx2="http://schemas.microsoft.com/office/drawing/2015/10/21/chartex" xmlns:cx3="http://schemas.microsoft.com/office/drawing/2016/5/9/chartex" xmlns:cx4="http://schemas.microsoft.com/office/drawing/2016/5/10/chartex" xmlns:cx5="http://schemas.microsoft.com/office/drawing/2016/5/11/chartex" xmlns:cx6="http://schemas.microsoft.com/office/drawing/2016/5/12/chartex" xmlns:cx7="http://schemas.microsoft.com/office/drawing/2016/5/13/chartex" xmlns:cx8="http://schemas.microsoft.com/office/drawing/2016/5/14/chartex" xmlns:mc="http://schemas.openxmlformats.org/markup-compatibility/2006" xmlns:aink="http://schemas.microsoft.com/office/drawing/2016/ink" xmlns:am3d="http://schemas.microsoft.com/office/drawing/2017/model3d" xmlns:o="urn:schemas-microsoft-com:office:office" xmlns:oel="http://schemas.microsoft.com/office/2019/extlst" xmlns:r="http://schemas.openxmlformats.org/officeDocument/2006/relationships" xmlns:m="http://schemas.openxmlformats.org/officeDocument/2006/math" xmlns:v="urn:schemas-microsoft-com:vml" xmlns:wp14="http://schemas.microsoft.com/office/word/2010/wordprocessingDrawing" xmlns:wp="http://schemas.openxmlformats.org/drawingml/2006/wordprocessingDrawing" xmlns:w10="urn:schemas-microsoft-com:office:word" xmlns:w="http://schemas.openxmlformats.org/wordprocessingml/2006/main" xmlns:w14="http://schemas.microsoft.com/office/word/2010/wordml" xmlns:w15="http://schemas.microsoft.com/office/word/2012/wordml" xmlns:w16cex="http://schemas.microsoft.com/office/word/2018/wordml/cex" xmlns:w16cid="http://schemas.microsoft.com/office/word/2016/wordml/cid" xmlns:w16="http://schemas.microsoft.com/office/word/2018/wordml" xmlns:w16du="http://schemas.microsoft.com/office/word/2023/wordml/word16du" xmlns:w16sdtdh="http://schemas.microsoft.com/office/word/2020/wordml/sdtdatahash" xmlns:w16sdtfl="http://schemas.microsoft.com/office/word/2024/wordml/sdtformatlock" xmlns:w16se="http://schemas.microsoft.com/office/word/2015/wordml/symex" xmlns:wpg="http://schemas.microsoft.com/office/word/2010/wordprocessingGroup" xmlns:wpi="http://schemas.microsoft.com/office/word/2010/wordprocessingInk" xmlns:wne="http://schemas.microsoft.com/office/word/2006/wordml" xmlns:wps="http://schemas.microsoft.com/office/word/2010/wordprocessingShape" mc:Ignorable="w14 w15 w16se w16cid w16 w16cex w16sdtdh w16sdtfl w16du wp14">
   <w:abstractNum w:abstractNumId="0" w15:restartNumberingAfterBreak="0">
+    <w:nsid w:val="04CB095B"/>
+    <w:multiLevelType w:val="multilevel"/>
+    <w:tmpl w:val="56F8F566"/>
+    <w:lvl w:ilvl="0">
+      <w:start w:val="1"/>
+      <w:numFmt w:val="bullet"/>
+      <w:lvlText w:val=""/>
+      <w:lvlJc w:val="left"/>
+      <w:pPr>
+        <w:tabs>
+          <w:tab w:val="num" w:pos="720"/>
+        </w:tabs>
+        <w:ind w:left="720" w:hanging="360"/>
+      </w:pPr>
+      <w:rPr>
+        <w:rFonts w:ascii="Symbol" w:hAnsi="Symbol" w:hint="default"/>
+        <w:sz w:val="20"/>
+      </w:rPr>
+    </w:lvl>
+    <w:lvl w:ilvl="1" w:tentative="1">
+      <w:start w:val="1"/>
+      <w:numFmt w:val="bullet"/>
+      <w:lvlText w:val="o"/>
+      <w:lvlJc w:val="left"/>
+      <w:pPr>
+        <w:tabs>
+          <w:tab w:val="num" w:pos="1440"/>
+        </w:tabs>
+        <w:ind w:left="1440" w:hanging="360"/>
+      </w:pPr>
+      <w:rPr>
+        <w:rFonts w:ascii="Courier New" w:hAnsi="Courier New" w:hint="default"/>
+        <w:sz w:val="20"/>
+      </w:rPr>
+    </w:lvl>
+    <w:lvl w:ilvl="2" w:tentative="1">
+      <w:start w:val="1"/>
+      <w:numFmt w:val="bullet"/>
+      <w:lvlText w:val=""/>
+      <w:lvlJc w:val="left"/>
+      <w:pPr>
+        <w:tabs>
+          <w:tab w:val="num" w:pos="2160"/>
+        </w:tabs>
+        <w:ind w:left="2160" w:hanging="360"/>
+      </w:pPr>
+      <w:rPr>
+        <w:rFonts w:ascii="Wingdings" w:hAnsi="Wingdings" w:hint="default"/>
+        <w:sz w:val="20"/>
+      </w:rPr>
+    </w:lvl>
+    <w:lvl w:ilvl="3" w:tentative="1">
+      <w:start w:val="1"/>
+      <w:numFmt w:val="bullet"/>
+      <w:lvlText w:val=""/>
+      <w:lvlJc w:val="left"/>
+      <w:pPr>
+        <w:tabs>
+          <w:tab w:val="num" w:pos="2880"/>
+        </w:tabs>
+        <w:ind w:left="2880" w:hanging="360"/>
+      </w:pPr>
+      <w:rPr>
+        <w:rFonts w:ascii="Wingdings" w:hAnsi="Wingdings" w:hint="default"/>
+        <w:sz w:val="20"/>
+      </w:rPr>
+    </w:lvl>
+    <w:lvl w:ilvl="4" w:tentative="1">
+      <w:start w:val="1"/>
+      <w:numFmt w:val="bullet"/>
+      <w:lvlText w:val=""/>
+      <w:lvlJc w:val="left"/>
+      <w:pPr>
+        <w:tabs>
+          <w:tab w:val="num" w:pos="3600"/>
+        </w:tabs>
+        <w:ind w:left="3600" w:hanging="360"/>
+      </w:pPr>
+      <w:rPr>
+        <w:rFonts w:ascii="Wingdings" w:hAnsi="Wingdings" w:hint="default"/>
+        <w:sz w:val="20"/>
+      </w:rPr>
+    </w:lvl>
+    <w:lvl w:ilvl="5" w:tentative="1">
+      <w:start w:val="1"/>
+      <w:numFmt w:val="bullet"/>
+      <w:lvlText w:val=""/>
+      <w:lvlJc w:val="left"/>
+      <w:pPr>
+        <w:tabs>
+          <w:tab w:val="num" w:pos="4320"/>
+        </w:tabs>
+        <w:ind w:left="4320" w:hanging="360"/>
+      </w:pPr>
+      <w:rPr>
+        <w:rFonts w:ascii="Wingdings" w:hAnsi="Wingdings" w:hint="default"/>
+        <w:sz w:val="20"/>
+      </w:rPr>
+    </w:lvl>
+    <w:lvl w:ilvl="6" w:tentative="1">
+      <w:start w:val="1"/>
+      <w:numFmt w:val="bullet"/>
+      <w:lvlText w:val=""/>
+      <w:lvlJc w:val="left"/>
+      <w:pPr>
+        <w:tabs>
+          <w:tab w:val="num" w:pos="5040"/>
+        </w:tabs>
+        <w:ind w:left="5040" w:hanging="360"/>
+      </w:pPr>
+      <w:rPr>
+        <w:rFonts w:ascii="Wingdings" w:hAnsi="Wingdings" w:hint="default"/>
+        <w:sz w:val="20"/>
+      </w:rPr>
+    </w:lvl>
+    <w:lvl w:ilvl="7" w:tentative="1">
+      <w:start w:val="1"/>
+      <w:numFmt w:val="bullet"/>
+      <w:lvlText w:val=""/>
+      <w:lvlJc w:val="left"/>
+      <w:pPr>
+        <w:tabs>
+          <w:tab w:val="num" w:pos="5760"/>
+        </w:tabs>
+        <w:ind w:left="5760" w:hanging="360"/>
+      </w:pPr>
+      <w:rPr>
+        <w:rFonts w:ascii="Wingdings" w:hAnsi="Wingdings" w:hint="default"/>
+        <w:sz w:val="20"/>
+      </w:rPr>
+    </w:lvl>
+    <w:lvl w:ilvl="8" w:tentative="1">
+      <w:start w:val="1"/>
+      <w:numFmt w:val="bullet"/>
+      <w:lvlText w:val=""/>
+      <w:lvlJc w:val="left"/>
+      <w:pPr>
+        <w:tabs>
+          <w:tab w:val="num" w:pos="6480"/>
+        </w:tabs>
+        <w:ind w:left="6480" w:hanging="360"/>
+      </w:pPr>
+      <w:rPr>
+        <w:rFonts w:ascii="Wingdings" w:hAnsi="Wingdings" w:hint="default"/>
+        <w:sz w:val="20"/>
+      </w:rPr>
+    </w:lvl>
+  </w:abstractNum>
+  <w:abstractNum w:abstractNumId="1" w15:restartNumberingAfterBreak="0">
     <w:nsid w:val="1EB30041"/>
     <w:multiLevelType w:val="multilevel"/>
     <w:tmpl w:val="F47E3462"/>
@@ -2347,7 +3007,7 @@
       </w:pPr>
     </w:lvl>
   </w:abstractNum>
-  <w:abstractNum w:abstractNumId="1" w15:restartNumberingAfterBreak="0">
+  <w:abstractNum w:abstractNumId="2" w15:restartNumberingAfterBreak="0">
     <w:nsid w:val="2F934F17"/>
     <w:multiLevelType w:val="multilevel"/>
     <w:tmpl w:val="EB827A38"/>
@@ -2460,7 +3120,7 @@
       </w:pPr>
     </w:lvl>
   </w:abstractNum>
-  <w:abstractNum w:abstractNumId="2" w15:restartNumberingAfterBreak="0">
+  <w:abstractNum w:abstractNumId="3" w15:restartNumberingAfterBreak="0">
     <w:nsid w:val="5F410EC9"/>
     <w:multiLevelType w:val="multilevel"/>
     <w:tmpl w:val="D0EEC04E"/>
@@ -2573,7 +3233,7 @@
       </w:pPr>
     </w:lvl>
   </w:abstractNum>
-  <w:abstractNum w:abstractNumId="3" w15:restartNumberingAfterBreak="0">
+  <w:abstractNum w:abstractNumId="4" w15:restartNumberingAfterBreak="0">
     <w:nsid w:val="69E42BF8"/>
     <w:multiLevelType w:val="multilevel"/>
     <w:tmpl w:val="EF16BD0C"/>
@@ -2686,7 +3346,7 @@
       </w:pPr>
     </w:lvl>
   </w:abstractNum>
-  <w:abstractNum w:abstractNumId="4" w15:restartNumberingAfterBreak="0">
+  <w:abstractNum w:abstractNumId="5" w15:restartNumberingAfterBreak="0">
     <w:nsid w:val="7F8B4ED6"/>
     <w:multiLevelType w:val="multilevel"/>
     <w:tmpl w:val="737CB8CC"/>
@@ -2800,19 +3460,22 @@
     </w:lvl>
   </w:abstractNum>
   <w:num w:numId="1" w16cid:durableId="120652666">
-    <w:abstractNumId w:val="0"/>
+    <w:abstractNumId w:val="1"/>
   </w:num>
   <w:num w:numId="2" w16cid:durableId="269432927">
+    <w:abstractNumId w:val="5"/>
+  </w:num>
+  <w:num w:numId="3" w16cid:durableId="360862939">
+    <w:abstractNumId w:val="3"/>
+  </w:num>
+  <w:num w:numId="4" w16cid:durableId="680741475">
+    <w:abstractNumId w:val="2"/>
+  </w:num>
+  <w:num w:numId="5" w16cid:durableId="2069957361">
     <w:abstractNumId w:val="4"/>
   </w:num>
-  <w:num w:numId="3" w16cid:durableId="360862939">
-    <w:abstractNumId w:val="2"/>
-  </w:num>
-  <w:num w:numId="4" w16cid:durableId="680741475">
-    <w:abstractNumId w:val="1"/>
-  </w:num>
-  <w:num w:numId="5" w16cid:durableId="2069957361">
-    <w:abstractNumId w:val="3"/>
+  <w:num w:numId="6" w16cid:durableId="1727293162">
+    <w:abstractNumId w:val="0"/>
   </w:num>
 </w:numbering>
 </file>
@@ -3225,7 +3888,6 @@
   <w:style w:type="character" w:default="1" w:styleId="a0">
     <w:name w:val="Default Paragraph Font"/>
     <w:uiPriority w:val="1"/>
-    <w:semiHidden/>
     <w:unhideWhenUsed/>
   </w:style>
   <w:style w:type="table" w:default="1" w:styleId="a1">

</xml_diff>